<commit_message>
Pridanie sekcii do dokumentacie
</commit_message>
<xml_diff>
--- a/SemestralneZadanie_Zula.docx
+++ b/SemestralneZadanie_Zula.docx
@@ -199,7 +199,7 @@
           <w:r>
             <w:fldChar w:fldCharType="separate"/>
           </w:r>
-          <w:hyperlink w:anchor="_Toc228522739" w:history="1">
+          <w:hyperlink w:anchor="_Toc228523841" w:history="1">
             <w:r>
               <w:rPr>
                 <w:rStyle w:val="Hypertextovprepojenie"/>
@@ -226,7 +226,7 @@
                 <w:noProof/>
                 <w:webHidden/>
               </w:rPr>
-              <w:instrText xml:space="preserve"> PAGEREF _Toc228522739 \h </w:instrText>
+              <w:instrText xml:space="preserve"> PAGEREF _Toc228523841 \h </w:instrText>
             </w:r>
             <w:r>
               <w:rPr>
@@ -271,7 +271,7 @@
               <w14:ligatures w14:val="none"/>
             </w:rPr>
           </w:pPr>
-          <w:hyperlink w:anchor="_Toc228522740" w:history="1">
+          <w:hyperlink w:anchor="_Toc228523842" w:history="1">
             <w:r>
               <w:rPr>
                 <w:rStyle w:val="Hypertextovprepojenie"/>
@@ -298,7 +298,7 @@
                 <w:noProof/>
                 <w:webHidden/>
               </w:rPr>
-              <w:instrText xml:space="preserve"> PAGEREF _Toc228522740 \h </w:instrText>
+              <w:instrText xml:space="preserve"> PAGEREF _Toc228523842 \h </w:instrText>
             </w:r>
             <w:r>
               <w:rPr>
@@ -343,7 +343,7 @@
               <w14:ligatures w14:val="none"/>
             </w:rPr>
           </w:pPr>
-          <w:hyperlink w:anchor="_Toc228522741" w:history="1">
+          <w:hyperlink w:anchor="_Toc228523843" w:history="1">
             <w:r>
               <w:rPr>
                 <w:rStyle w:val="Hypertextovprepojenie"/>
@@ -370,7 +370,7 @@
                 <w:noProof/>
                 <w:webHidden/>
               </w:rPr>
-              <w:instrText xml:space="preserve"> PAGEREF _Toc228522741 \h </w:instrText>
+              <w:instrText xml:space="preserve"> PAGEREF _Toc228523843 \h </w:instrText>
             </w:r>
             <w:r>
               <w:rPr>
@@ -414,7 +414,7 @@
               <w14:ligatures w14:val="none"/>
             </w:rPr>
           </w:pPr>
-          <w:hyperlink w:anchor="_Toc228522742" w:history="1">
+          <w:hyperlink w:anchor="_Toc228523844" w:history="1">
             <w:r>
               <w:rPr>
                 <w:rStyle w:val="Hypertextovprepojenie"/>
@@ -441,7 +441,7 @@
                 <w:noProof/>
                 <w:webHidden/>
               </w:rPr>
-              <w:instrText xml:space="preserve"> PAGEREF _Toc228522742 \h </w:instrText>
+              <w:instrText xml:space="preserve"> PAGEREF _Toc228523844 \h </w:instrText>
             </w:r>
             <w:r>
               <w:rPr>
@@ -485,7 +485,7 @@
               <w14:ligatures w14:val="none"/>
             </w:rPr>
           </w:pPr>
-          <w:hyperlink w:anchor="_Toc228522743" w:history="1">
+          <w:hyperlink w:anchor="_Toc228523845" w:history="1">
             <w:r>
               <w:rPr>
                 <w:rStyle w:val="Hypertextovprepojenie"/>
@@ -512,7 +512,7 @@
                 <w:noProof/>
                 <w:webHidden/>
               </w:rPr>
-              <w:instrText xml:space="preserve"> PAGEREF _Toc228522743 \h </w:instrText>
+              <w:instrText xml:space="preserve"> PAGEREF _Toc228523845 \h </w:instrText>
             </w:r>
             <w:r>
               <w:rPr>
@@ -556,7 +556,7 @@
               <w14:ligatures w14:val="none"/>
             </w:rPr>
           </w:pPr>
-          <w:hyperlink w:anchor="_Toc228522744" w:history="1">
+          <w:hyperlink w:anchor="_Toc228523846" w:history="1">
             <w:r>
               <w:rPr>
                 <w:rStyle w:val="Hypertextovprepojenie"/>
@@ -583,7 +583,7 @@
                 <w:noProof/>
                 <w:webHidden/>
               </w:rPr>
-              <w:instrText xml:space="preserve"> PAGEREF _Toc228522744 \h </w:instrText>
+              <w:instrText xml:space="preserve"> PAGEREF _Toc228523846 \h </w:instrText>
             </w:r>
             <w:r>
               <w:rPr>
@@ -627,7 +627,7 @@
               <w14:ligatures w14:val="none"/>
             </w:rPr>
           </w:pPr>
-          <w:hyperlink w:anchor="_Toc228522745" w:history="1">
+          <w:hyperlink w:anchor="_Toc228523847" w:history="1">
             <w:r>
               <w:rPr>
                 <w:rStyle w:val="Hypertextovprepojenie"/>
@@ -654,7 +654,7 @@
                 <w:noProof/>
                 <w:webHidden/>
               </w:rPr>
-              <w:instrText xml:space="preserve"> PAGEREF _Toc228522745 \h </w:instrText>
+              <w:instrText xml:space="preserve"> PAGEREF _Toc228523847 \h </w:instrText>
             </w:r>
             <w:r>
               <w:rPr>
@@ -698,7 +698,7 @@
               <w14:ligatures w14:val="none"/>
             </w:rPr>
           </w:pPr>
-          <w:hyperlink w:anchor="_Toc228522746" w:history="1">
+          <w:hyperlink w:anchor="_Toc228523848" w:history="1">
             <w:r>
               <w:rPr>
                 <w:rStyle w:val="Hypertextovprepojenie"/>
@@ -725,7 +725,7 @@
                 <w:noProof/>
                 <w:webHidden/>
               </w:rPr>
-              <w:instrText xml:space="preserve"> PAGEREF _Toc228522746 \h </w:instrText>
+              <w:instrText xml:space="preserve"> PAGEREF _Toc228523848 \h </w:instrText>
             </w:r>
             <w:r>
               <w:rPr>
@@ -769,7 +769,7 @@
               <w14:ligatures w14:val="none"/>
             </w:rPr>
           </w:pPr>
-          <w:hyperlink w:anchor="_Toc228522747" w:history="1">
+          <w:hyperlink w:anchor="_Toc228523849" w:history="1">
             <w:r>
               <w:rPr>
                 <w:rStyle w:val="Hypertextovprepojenie"/>
@@ -796,7 +796,7 @@
                 <w:noProof/>
                 <w:webHidden/>
               </w:rPr>
-              <w:instrText xml:space="preserve"> PAGEREF _Toc228522747 \h </w:instrText>
+              <w:instrText xml:space="preserve"> PAGEREF _Toc228523849 \h </w:instrText>
             </w:r>
             <w:r>
               <w:rPr>
@@ -817,6 +817,219 @@
                 <w:webHidden/>
               </w:rPr>
               <w:t>8</w:t>
+            </w:r>
+            <w:r>
+              <w:rPr>
+                <w:noProof/>
+                <w:webHidden/>
+              </w:rPr>
+              <w:fldChar w:fldCharType="end"/>
+            </w:r>
+          </w:hyperlink>
+        </w:p>
+        <w:p>
+          <w:pPr>
+            <w:pStyle w:val="Obsah3"/>
+            <w:rPr>
+              <w:rFonts w:eastAsiaTheme="minorEastAsia" w:cstheme="minorBidi"/>
+              <w:noProof/>
+              <w:kern w:val="0"/>
+              <w:sz w:val="22"/>
+              <w:szCs w:val="22"/>
+              <w:lang w:eastAsia="sk-SK"/>
+              <w14:ligatures w14:val="none"/>
+            </w:rPr>
+          </w:pPr>
+          <w:hyperlink w:anchor="_Toc228523850" w:history="1">
+            <w:r>
+              <w:rPr>
+                <w:rStyle w:val="Hypertextovprepojenie"/>
+                <w:noProof/>
+              </w:rPr>
+              <w:t>1.2.7 Používateľská príručka</w:t>
+            </w:r>
+            <w:r>
+              <w:rPr>
+                <w:noProof/>
+                <w:webHidden/>
+              </w:rPr>
+              <w:tab/>
+            </w:r>
+            <w:r>
+              <w:rPr>
+                <w:noProof/>
+                <w:webHidden/>
+              </w:rPr>
+              <w:fldChar w:fldCharType="begin"/>
+            </w:r>
+            <w:r>
+              <w:rPr>
+                <w:noProof/>
+                <w:webHidden/>
+              </w:rPr>
+              <w:instrText xml:space="preserve"> PAGEREF _Toc228523850 \h </w:instrText>
+            </w:r>
+            <w:r>
+              <w:rPr>
+                <w:noProof/>
+                <w:webHidden/>
+              </w:rPr>
+            </w:r>
+            <w:r>
+              <w:rPr>
+                <w:noProof/>
+                <w:webHidden/>
+              </w:rPr>
+              <w:fldChar w:fldCharType="separate"/>
+            </w:r>
+            <w:r>
+              <w:rPr>
+                <w:noProof/>
+                <w:webHidden/>
+              </w:rPr>
+              <w:t>8</w:t>
+            </w:r>
+            <w:r>
+              <w:rPr>
+                <w:noProof/>
+                <w:webHidden/>
+              </w:rPr>
+              <w:fldChar w:fldCharType="end"/>
+            </w:r>
+          </w:hyperlink>
+        </w:p>
+        <w:p>
+          <w:pPr>
+            <w:pStyle w:val="Obsah3"/>
+            <w:rPr>
+              <w:rFonts w:eastAsiaTheme="minorEastAsia" w:cstheme="minorBidi"/>
+              <w:noProof/>
+              <w:kern w:val="0"/>
+              <w:sz w:val="22"/>
+              <w:szCs w:val="22"/>
+              <w:lang w:eastAsia="sk-SK"/>
+              <w14:ligatures w14:val="none"/>
+            </w:rPr>
+          </w:pPr>
+          <w:hyperlink w:anchor="_Toc228523851" w:history="1">
+            <w:r>
+              <w:rPr>
+                <w:rStyle w:val="Hypertextovprepojenie"/>
+                <w:noProof/>
+              </w:rPr>
+              <w:t>1.2.8 Vývojárska príručka a architektúra</w:t>
+            </w:r>
+            <w:r>
+              <w:rPr>
+                <w:noProof/>
+                <w:webHidden/>
+              </w:rPr>
+              <w:tab/>
+            </w:r>
+            <w:r>
+              <w:rPr>
+                <w:noProof/>
+                <w:webHidden/>
+              </w:rPr>
+              <w:fldChar w:fldCharType="begin"/>
+            </w:r>
+            <w:r>
+              <w:rPr>
+                <w:noProof/>
+                <w:webHidden/>
+              </w:rPr>
+              <w:instrText xml:space="preserve"> PAGEREF _Toc228523851 \h </w:instrText>
+            </w:r>
+            <w:r>
+              <w:rPr>
+                <w:noProof/>
+                <w:webHidden/>
+              </w:rPr>
+            </w:r>
+            <w:r>
+              <w:rPr>
+                <w:noProof/>
+                <w:webHidden/>
+              </w:rPr>
+              <w:fldChar w:fldCharType="separate"/>
+            </w:r>
+            <w:r>
+              <w:rPr>
+                <w:noProof/>
+                <w:webHidden/>
+              </w:rPr>
+              <w:t>9</w:t>
+            </w:r>
+            <w:r>
+              <w:rPr>
+                <w:noProof/>
+                <w:webHidden/>
+              </w:rPr>
+              <w:fldChar w:fldCharType="end"/>
+            </w:r>
+          </w:hyperlink>
+        </w:p>
+        <w:p>
+          <w:pPr>
+            <w:pStyle w:val="Obsah3"/>
+            <w:rPr>
+              <w:rFonts w:eastAsiaTheme="minorEastAsia" w:cstheme="minorBidi"/>
+              <w:noProof/>
+              <w:kern w:val="0"/>
+              <w:sz w:val="22"/>
+              <w:szCs w:val="22"/>
+              <w:lang w:eastAsia="sk-SK"/>
+              <w14:ligatures w14:val="none"/>
+            </w:rPr>
+          </w:pPr>
+          <w:hyperlink w:anchor="_Toc228523852" w:history="1">
+            <w:r>
+              <w:rPr>
+                <w:rStyle w:val="Hypertextovprepojenie"/>
+                <w:noProof/>
+              </w:rPr>
+              <w:t>1.2.9 UML diagram</w:t>
+            </w:r>
+            <w:r>
+              <w:rPr>
+                <w:noProof/>
+                <w:webHidden/>
+              </w:rPr>
+              <w:tab/>
+            </w:r>
+            <w:r>
+              <w:rPr>
+                <w:noProof/>
+                <w:webHidden/>
+              </w:rPr>
+              <w:fldChar w:fldCharType="begin"/>
+            </w:r>
+            <w:r>
+              <w:rPr>
+                <w:noProof/>
+                <w:webHidden/>
+              </w:rPr>
+              <w:instrText xml:space="preserve"> PAGEREF _Toc228523852 \h </w:instrText>
+            </w:r>
+            <w:r>
+              <w:rPr>
+                <w:noProof/>
+                <w:webHidden/>
+              </w:rPr>
+            </w:r>
+            <w:r>
+              <w:rPr>
+                <w:noProof/>
+                <w:webHidden/>
+              </w:rPr>
+              <w:fldChar w:fldCharType="separate"/>
+            </w:r>
+            <w:r>
+              <w:rPr>
+                <w:noProof/>
+                <w:webHidden/>
+              </w:rPr>
+              <w:t>10</w:t>
             </w:r>
             <w:r>
               <w:rPr>
@@ -843,7 +1056,7 @@
               <w14:ligatures w14:val="none"/>
             </w:rPr>
           </w:pPr>
-          <w:hyperlink w:anchor="_Toc228522748" w:history="1">
+          <w:hyperlink w:anchor="_Toc228523853" w:history="1">
             <w:r>
               <w:rPr>
                 <w:rStyle w:val="Hypertextovprepojenie"/>
@@ -870,7 +1083,7 @@
                 <w:noProof/>
                 <w:webHidden/>
               </w:rPr>
-              <w:instrText xml:space="preserve"> PAGEREF _Toc228522748 \h </w:instrText>
+              <w:instrText xml:space="preserve"> PAGEREF _Toc228523853 \h </w:instrText>
             </w:r>
             <w:r>
               <w:rPr>
@@ -890,7 +1103,81 @@
                 <w:noProof/>
                 <w:webHidden/>
               </w:rPr>
-              <w:t>9</w:t>
+              <w:t>11</w:t>
+            </w:r>
+            <w:r>
+              <w:rPr>
+                <w:noProof/>
+                <w:webHidden/>
+              </w:rPr>
+              <w:fldChar w:fldCharType="end"/>
+            </w:r>
+          </w:hyperlink>
+        </w:p>
+        <w:p>
+          <w:pPr>
+            <w:pStyle w:val="Obsah1"/>
+            <w:spacing w:before="240"/>
+            <w:rPr>
+              <w:rFonts w:eastAsiaTheme="minorEastAsia" w:cstheme="minorBidi"/>
+              <w:b w:val="0"/>
+              <w:bCs w:val="0"/>
+              <w:noProof/>
+              <w:kern w:val="0"/>
+              <w:sz w:val="22"/>
+              <w:szCs w:val="22"/>
+              <w:lang w:eastAsia="sk-SK"/>
+              <w14:ligatures w14:val="none"/>
+            </w:rPr>
+          </w:pPr>
+          <w:hyperlink w:anchor="_Toc228523854" w:history="1">
+            <w:r>
+              <w:rPr>
+                <w:rStyle w:val="Hypertextovprepojenie"/>
+                <w:noProof/>
+              </w:rPr>
+              <w:t>Zdroje</w:t>
+            </w:r>
+            <w:r>
+              <w:rPr>
+                <w:noProof/>
+                <w:webHidden/>
+              </w:rPr>
+              <w:tab/>
+            </w:r>
+            <w:r>
+              <w:rPr>
+                <w:noProof/>
+                <w:webHidden/>
+              </w:rPr>
+              <w:fldChar w:fldCharType="begin"/>
+            </w:r>
+            <w:r>
+              <w:rPr>
+                <w:noProof/>
+                <w:webHidden/>
+              </w:rPr>
+              <w:instrText xml:space="preserve"> PAGEREF _Toc228523854 \h </w:instrText>
+            </w:r>
+            <w:r>
+              <w:rPr>
+                <w:noProof/>
+                <w:webHidden/>
+              </w:rPr>
+            </w:r>
+            <w:r>
+              <w:rPr>
+                <w:noProof/>
+                <w:webHidden/>
+              </w:rPr>
+              <w:fldChar w:fldCharType="separate"/>
+            </w:r>
+            <w:r>
+              <w:rPr>
+                <w:noProof/>
+                <w:webHidden/>
+              </w:rPr>
+              <w:t>12</w:t>
             </w:r>
             <w:r>
               <w:rPr>
@@ -917,7 +1204,7 @@
         <w:pStyle w:val="Nadpis1bezslovania"/>
         <w:spacing w:after="480"/>
       </w:pPr>
-      <w:bookmarkStart w:id="0" w:name="_Toc228522739"/>
+      <w:bookmarkStart w:id="0" w:name="_Toc228523841"/>
       <w:r>
         <w:lastRenderedPageBreak/>
         <w:t>Monitorovanie a riadenie teploty pomocou webovej aplikácie</w:t>
@@ -929,7 +1216,7 @@
         <w:pStyle w:val="Nadpis2"/>
         <w:spacing w:before="480" w:after="240"/>
       </w:pPr>
-      <w:bookmarkStart w:id="1" w:name="_Toc228522740"/>
+      <w:bookmarkStart w:id="1" w:name="_Toc228523842"/>
       <w:r>
         <w:t>Zadanie projektu</w:t>
       </w:r>
@@ -946,13 +1233,45 @@
         <w:t xml:space="preserve"> a reguláciu teploty pomocou chladiaceho ventilátora prostredníctvom webovej aplikácie.</w:t>
       </w:r>
       <w:r>
-        <w:t xml:space="preserve"> Systém spája mikrokontrolér A</w:t>
-      </w:r>
-      <w:r>
-        <w:t>rduino Uno, ktorý sníma namerané údaje (teplotu, otáčky</w:t>
-      </w:r>
-      <w:r>
-        <w:t>), a virtuálne Raspberry Pi, k</w:t>
+        <w:t xml:space="preserve"> Systém spája </w:t>
+      </w:r>
+      <w:proofErr w:type="spellStart"/>
+      <w:r>
+        <w:t>mikrokontrolér</w:t>
+      </w:r>
+      <w:proofErr w:type="spellEnd"/>
+      <w:r>
+        <w:t xml:space="preserve"> </w:t>
+      </w:r>
+      <w:proofErr w:type="spellStart"/>
+      <w:r>
+        <w:t>A</w:t>
+      </w:r>
+      <w:r>
+        <w:t>rduino</w:t>
+      </w:r>
+      <w:proofErr w:type="spellEnd"/>
+      <w:r>
+        <w:t xml:space="preserve"> </w:t>
+      </w:r>
+      <w:proofErr w:type="spellStart"/>
+      <w:r>
+        <w:t>Uno</w:t>
+      </w:r>
+      <w:proofErr w:type="spellEnd"/>
+      <w:r>
+        <w:t>, ktorý sníma namerané údaje (teplotu, otáčky</w:t>
+      </w:r>
+      <w:r>
+        <w:t xml:space="preserve">), a virtuálne </w:t>
+      </w:r>
+      <w:proofErr w:type="spellStart"/>
+      <w:r>
+        <w:t>Raspberry</w:t>
+      </w:r>
+      <w:proofErr w:type="spellEnd"/>
+      <w:r>
+        <w:t xml:space="preserve"> Pi, k</w:t>
       </w:r>
       <w:r>
         <w:t>toré riadi obvod a vizualizuje údaje na diaľku pomocou webového prehliadača.</w:t>
@@ -963,7 +1282,7 @@
         <w:pStyle w:val="Nadpis2"/>
         <w:spacing w:before="480" w:after="240"/>
       </w:pPr>
-      <w:bookmarkStart w:id="2" w:name="_Toc228522741"/>
+      <w:bookmarkStart w:id="2" w:name="_Toc228523843"/>
       <w:r>
         <w:t>Riešenie projektu</w:t>
       </w:r>
@@ -973,7 +1292,7 @@
       <w:pPr>
         <w:pStyle w:val="Nadpis3"/>
       </w:pPr>
-      <w:bookmarkStart w:id="3" w:name="_Toc228522742"/>
+      <w:bookmarkStart w:id="3" w:name="_Toc228523844"/>
       <w:r>
         <w:t>Hardvér a zapojenie</w:t>
       </w:r>
@@ -991,9 +1310,19 @@
       <w:pPr>
         <w:pStyle w:val="slovanzoznam2"/>
       </w:pPr>
-      <w:r>
-        <w:t>Arduino Uno</w:t>
-      </w:r>
+      <w:proofErr w:type="spellStart"/>
+      <w:r>
+        <w:t>Arduino</w:t>
+      </w:r>
+      <w:proofErr w:type="spellEnd"/>
+      <w:r>
+        <w:t xml:space="preserve"> </w:t>
+      </w:r>
+      <w:proofErr w:type="spellStart"/>
+      <w:r>
+        <w:t>Uno</w:t>
+      </w:r>
+      <w:proofErr w:type="spellEnd"/>
     </w:p>
     <w:p>
       <w:pPr>
@@ -1008,8 +1337,13 @@
         <w:pStyle w:val="slovanzoznam2"/>
       </w:pPr>
       <w:r>
-        <w:t>Ventilátor ARCTIC P12 Slim</w:t>
-      </w:r>
+        <w:t xml:space="preserve">Ventilátor ARCTIC P12 </w:t>
+      </w:r>
+      <w:proofErr w:type="spellStart"/>
+      <w:r>
+        <w:t>Slim</w:t>
+      </w:r>
+      <w:proofErr w:type="spellEnd"/>
     </w:p>
     <w:p>
       <w:pPr>
@@ -1041,7 +1375,23 @@
         <w:t xml:space="preserve">Tento senzor je ideálnou voľbou pre toto zadanie, dokáže byť </w:t>
       </w:r>
       <w:r>
-        <w:t>napojený priamo na VCC 5V pin na Arduine a</w:t>
+        <w:t xml:space="preserve">napojený priamo na VCC 5V </w:t>
+      </w:r>
+      <w:proofErr w:type="spellStart"/>
+      <w:r>
+        <w:t>pin</w:t>
+      </w:r>
+      <w:proofErr w:type="spellEnd"/>
+      <w:r>
+        <w:t xml:space="preserve"> na </w:t>
+      </w:r>
+      <w:proofErr w:type="spellStart"/>
+      <w:r>
+        <w:t>Arduine</w:t>
+      </w:r>
+      <w:proofErr w:type="spellEnd"/>
+      <w:r>
+        <w:t xml:space="preserve"> a</w:t>
       </w:r>
       <w:r>
         <w:t> tento konkrétny 3 pinový mod</w:t>
@@ -1218,8 +1568,13 @@
         <w:pStyle w:val="Nadpis4"/>
       </w:pPr>
       <w:r>
-        <w:t>Ventilátor ARCTIC P12 Slim</w:t>
-      </w:r>
+        <w:t xml:space="preserve">Ventilátor ARCTIC P12 </w:t>
+      </w:r>
+      <w:proofErr w:type="spellStart"/>
+      <w:r>
+        <w:t>Slim</w:t>
+      </w:r>
+      <w:proofErr w:type="spellEnd"/>
     </w:p>
     <w:p>
       <w:pPr>
@@ -1356,8 +1711,13 @@
         <w:t xml:space="preserve"> </w:t>
       </w:r>
       <w:r>
-        <w:t>Ventilátor ARCTIC P12 Slim</w:t>
-      </w:r>
+        <w:t xml:space="preserve">Ventilátor ARCTIC P12 </w:t>
+      </w:r>
+      <w:proofErr w:type="spellStart"/>
+      <w:r>
+        <w:t>Slim</w:t>
+      </w:r>
+      <w:proofErr w:type="spellEnd"/>
       <w:sdt>
         <w:sdtPr>
           <w:rPr>
@@ -1405,13 +1765,29 @@
         <w:t>Zapojenie obvodu je realizované na obrázku 3</w:t>
       </w:r>
       <w:r>
-        <w:t>, okrem zapojenia osobitných napájaní a dátových pinov pre senzor teploty a ventilátor je potrebné ešte prepojiť zem medzi týmito</w:t>
+        <w:t xml:space="preserve">, okrem zapojenia osobitných napájaní a dátových </w:t>
+      </w:r>
+      <w:proofErr w:type="spellStart"/>
+      <w:r>
+        <w:t>pinov</w:t>
+      </w:r>
+      <w:proofErr w:type="spellEnd"/>
+      <w:r>
+        <w:t xml:space="preserve"> pre senzor teploty a ventilátor je potrebné ešte prepojiť zem medzi týmito</w:t>
       </w:r>
       <w:r>
         <w:t xml:space="preserve"> komponentami aby ventilátor dokázal byť ovládaný pomocou</w:t>
       </w:r>
       <w:r>
-        <w:t xml:space="preserve"> PWM signálu z Arduina.</w:t>
+        <w:t xml:space="preserve"> PWM signálu z </w:t>
+      </w:r>
+      <w:proofErr w:type="spellStart"/>
+      <w:r>
+        <w:t>Arduina</w:t>
+      </w:r>
+      <w:proofErr w:type="spellEnd"/>
+      <w:r>
+        <w:t>.</w:t>
       </w:r>
     </w:p>
     <w:p>
@@ -1530,7 +1906,15 @@
         <w:pStyle w:val="Bezodsadenia"/>
       </w:pPr>
       <w:r>
-        <w:t>Jednotlivé piny:</w:t>
+        <w:t xml:space="preserve">Jednotlivé </w:t>
+      </w:r>
+      <w:proofErr w:type="spellStart"/>
+      <w:r>
+        <w:t>piny</w:t>
+      </w:r>
+      <w:proofErr w:type="spellEnd"/>
+      <w:r>
+        <w:t>:</w:t>
       </w:r>
     </w:p>
     <w:p>
@@ -1538,7 +1922,15 @@
         <w:pStyle w:val="Zoznamsodrkami"/>
       </w:pPr>
       <w:r>
-        <w:t>D2 – Pin 4 z ventilátora – zobrazenie otáčok</w:t>
+        <w:t xml:space="preserve">D2 – </w:t>
+      </w:r>
+      <w:proofErr w:type="spellStart"/>
+      <w:r>
+        <w:t>Pin</w:t>
+      </w:r>
+      <w:proofErr w:type="spellEnd"/>
+      <w:r>
+        <w:t xml:space="preserve"> 4 z ventilátora – zobrazenie otáčok</w:t>
       </w:r>
     </w:p>
     <w:p>
@@ -1546,7 +1938,15 @@
         <w:pStyle w:val="Zoznamsodrkami"/>
       </w:pPr>
       <w:r>
-        <w:t>D4 – Dátový pin DHT11</w:t>
+        <w:t xml:space="preserve">D4 – Dátový </w:t>
+      </w:r>
+      <w:proofErr w:type="spellStart"/>
+      <w:r>
+        <w:t>pin</w:t>
+      </w:r>
+      <w:proofErr w:type="spellEnd"/>
+      <w:r>
+        <w:t xml:space="preserve"> DHT11</w:t>
       </w:r>
     </w:p>
     <w:p>
@@ -1554,16 +1954,37 @@
         <w:pStyle w:val="Zoznamsodrkami"/>
       </w:pPr>
       <w:r>
-        <w:t>D9 – Pin 3/PWM pin ventilátora</w:t>
+        <w:t xml:space="preserve">D9 – </w:t>
+      </w:r>
+      <w:proofErr w:type="spellStart"/>
+      <w:r>
+        <w:t>Pin</w:t>
+      </w:r>
+      <w:proofErr w:type="spellEnd"/>
+      <w:r>
+        <w:t xml:space="preserve"> 3/PWM </w:t>
+      </w:r>
+      <w:proofErr w:type="spellStart"/>
+      <w:r>
+        <w:t>pin</w:t>
+      </w:r>
+      <w:proofErr w:type="spellEnd"/>
+      <w:r>
+        <w:t xml:space="preserve"> ventilátora</w:t>
       </w:r>
     </w:p>
     <w:p>
       <w:pPr>
         <w:pStyle w:val="Nadpis3"/>
       </w:pPr>
-      <w:bookmarkStart w:id="4" w:name="_Toc228522743"/>
-      <w:r>
-        <w:t>Arduino IDE kód</w:t>
+      <w:bookmarkStart w:id="4" w:name="_Toc228523845"/>
+      <w:proofErr w:type="spellStart"/>
+      <w:r>
+        <w:t>Arduino</w:t>
+      </w:r>
+      <w:proofErr w:type="spellEnd"/>
+      <w:r>
+        <w:t xml:space="preserve"> IDE kód</w:t>
       </w:r>
       <w:bookmarkEnd w:id="4"/>
     </w:p>
@@ -1575,7 +1996,15 @@
         </w:rPr>
       </w:pPr>
       <w:r>
-        <w:t xml:space="preserve">Prvým krokom je napísanie potrebného kódu v Arduino IDE pre </w:t>
+        <w:t>Prvým krokom je napísanie potrebného kódu v </w:t>
+      </w:r>
+      <w:proofErr w:type="spellStart"/>
+      <w:r>
+        <w:t>Arduino</w:t>
+      </w:r>
+      <w:proofErr w:type="spellEnd"/>
+      <w:r>
+        <w:t xml:space="preserve"> IDE pre </w:t>
       </w:r>
       <w:r>
         <w:t>odosielanie potrebných informácií z obvodu do počítača, aby virtuálne prostredie vedelo tieto údaje použiť.</w:t>
@@ -1590,10 +2019,26 @@
         <w:t xml:space="preserve"> zo senzora teploty,</w:t>
       </w:r>
       <w:r>
-        <w:t xml:space="preserve"> zmeria impulzy z pinu 4 ventilátora a prepočíta ich na otáčky ktoré ventilátor má</w:t>
-      </w:r>
-      <w:r>
-        <w:t xml:space="preserve"> a dokáže nastavovať žiadanú striedu </w:t>
+        <w:t xml:space="preserve"> zmeria impulzy z </w:t>
+      </w:r>
+      <w:proofErr w:type="spellStart"/>
+      <w:r>
+        <w:t>pinu</w:t>
+      </w:r>
+      <w:proofErr w:type="spellEnd"/>
+      <w:r>
+        <w:t xml:space="preserve"> 4 ventilátora a prepočíta ich na otáčky ktoré ventilátor má</w:t>
+      </w:r>
+      <w:r>
+        <w:t xml:space="preserve"> a dokáže nastavovať žiadanú </w:t>
+      </w:r>
+      <w:proofErr w:type="spellStart"/>
+      <w:r>
+        <w:t>striedu</w:t>
+      </w:r>
+      <w:proofErr w:type="spellEnd"/>
+      <w:r>
+        <w:t xml:space="preserve"> </w:t>
       </w:r>
       <w:r>
         <w:lastRenderedPageBreak/>
@@ -1605,6 +2050,7 @@
       <w:r>
         <w:t xml:space="preserve"> Tento kód je v prílohe pod názvom </w:t>
       </w:r>
+      <w:proofErr w:type="spellStart"/>
       <w:r>
         <w:rPr>
           <w:i/>
@@ -1619,6 +2065,7 @@
         </w:rPr>
         <w:t>ino</w:t>
       </w:r>
+      <w:proofErr w:type="spellEnd"/>
       <w:r>
         <w:t xml:space="preserve"> alebo na adrese</w:t>
       </w:r>
@@ -1639,7 +2086,7 @@
       <w:pPr>
         <w:pStyle w:val="Nadpis3"/>
       </w:pPr>
-      <w:bookmarkStart w:id="5" w:name="_Toc228522744"/>
+      <w:bookmarkStart w:id="5" w:name="_Toc228523846"/>
       <w:r>
         <w:t>Pridanie sériového portu do virtuálneho prostredia</w:t>
       </w:r>
@@ -1660,8 +2107,17 @@
           <w:b/>
           <w:bCs/>
         </w:rPr>
-        <w:t>USB Passthrough</w:t>
-      </w:r>
+        <w:t xml:space="preserve">USB </w:t>
+      </w:r>
+      <w:proofErr w:type="spellStart"/>
+      <w:r>
+        <w:rPr>
+          <w:b/>
+          <w:bCs/>
+        </w:rPr>
+        <w:t>Passthrough</w:t>
+      </w:r>
+      <w:proofErr w:type="spellEnd"/>
       <w:r>
         <w:t>. To spravíme keď klikneme pravým tlačidlom myši na naše virtuálne prostredie</w:t>
       </w:r>
@@ -1695,7 +2151,23 @@
         <w:t xml:space="preserve"> (krok 3)</w:t>
       </w:r>
       <w:r>
-        <w:t>, potom ikonu pridania USB (krok 4) a tam je potrebné si zvoliť port kde je zapojené naše Arduino (v názve bude obsahovať Arduino alebo</w:t>
+        <w:t xml:space="preserve">, potom ikonu pridania USB (krok 4) a tam je potrebné si zvoliť port kde je zapojené naše </w:t>
+      </w:r>
+      <w:proofErr w:type="spellStart"/>
+      <w:r>
+        <w:t>Arduino</w:t>
+      </w:r>
+      <w:proofErr w:type="spellEnd"/>
+      <w:r>
+        <w:t xml:space="preserve"> (v názve bude obsahovať </w:t>
+      </w:r>
+      <w:proofErr w:type="spellStart"/>
+      <w:r>
+        <w:t>Arduino</w:t>
+      </w:r>
+      <w:proofErr w:type="spellEnd"/>
+      <w:r>
+        <w:t xml:space="preserve"> alebo</w:t>
       </w:r>
       <w:r>
         <w:t xml:space="preserve"> UNO R3 v mojom prípade). Tento postup je aj zobrazený na obrázku</w:t>
@@ -1832,13 +2304,47 @@
       <w:r>
         <w:t xml:space="preserve">V termináli vo virtuálnom prostredí je potrebné nainštalovať knižnicu na sériovú komunikáciu pomocou príkazu </w:t>
       </w:r>
+      <w:proofErr w:type="spellStart"/>
       <w:r>
         <w:rPr>
           <w:i/>
           <w:iCs/>
         </w:rPr>
-        <w:t>pip install pyserial</w:t>
-      </w:r>
+        <w:t>pip</w:t>
+      </w:r>
+      <w:proofErr w:type="spellEnd"/>
+      <w:r>
+        <w:rPr>
+          <w:i/>
+          <w:iCs/>
+        </w:rPr>
+        <w:t xml:space="preserve"> </w:t>
+      </w:r>
+      <w:proofErr w:type="spellStart"/>
+      <w:r>
+        <w:rPr>
+          <w:i/>
+          <w:iCs/>
+        </w:rPr>
+        <w:t>install</w:t>
+      </w:r>
+      <w:proofErr w:type="spellEnd"/>
+      <w:r>
+        <w:rPr>
+          <w:i/>
+          <w:iCs/>
+        </w:rPr>
+        <w:t xml:space="preserve"> </w:t>
+      </w:r>
+      <w:proofErr w:type="spellStart"/>
+      <w:r>
+        <w:rPr>
+          <w:i/>
+          <w:iCs/>
+        </w:rPr>
+        <w:t>pyserial</w:t>
+      </w:r>
+      <w:proofErr w:type="spellEnd"/>
       <w:r>
         <w:t>.</w:t>
       </w:r>
@@ -1847,7 +2353,7 @@
       <w:pPr>
         <w:pStyle w:val="Nadpis3"/>
       </w:pPr>
-      <w:bookmarkStart w:id="6" w:name="_Toc228522745"/>
+      <w:bookmarkStart w:id="6" w:name="_Toc228523847"/>
       <w:r>
         <w:lastRenderedPageBreak/>
         <w:t>Serverová časť kódu – app.py</w:t>
@@ -1898,39 +2404,81 @@
       <w:r>
         <w:t xml:space="preserve"> Vo vlákne </w:t>
       </w:r>
+      <w:proofErr w:type="spellStart"/>
       <w:r>
         <w:rPr>
           <w:i/>
           <w:iCs/>
         </w:rPr>
-        <w:t>background_thread()</w:t>
+        <w:t>background_thread</w:t>
+      </w:r>
+      <w:proofErr w:type="spellEnd"/>
+      <w:r>
+        <w:rPr>
+          <w:i/>
+          <w:iCs/>
+        </w:rPr>
+        <w:t>()</w:t>
       </w:r>
       <w:r>
         <w:t xml:space="preserve"> boli pôvodné matematické funkcie nahradení funkciou </w:t>
       </w:r>
+      <w:proofErr w:type="spellStart"/>
       <w:r>
         <w:rPr>
           <w:b/>
           <w:bCs/>
         </w:rPr>
-        <w:t>ser.readline()</w:t>
-      </w:r>
-      <w:r>
-        <w:t>, ktorá zo sériového portu (vo virtuálnom prostredí označenom ako /dev/ttyUSB0 alebo /dev/ttyACM0)</w:t>
-      </w:r>
-      <w:r>
-        <w:t xml:space="preserve"> neustále prijíma dáta z Arduina (Teplota, otáčky) a odosiela príkazy (PWM) naspäť do hardvéru.</w:t>
-      </w:r>
-    </w:p>
-    <w:p>
-      <w:pPr>
-        <w:pStyle w:val="Zoznamsodrkami"/>
-      </w:pPr>
+        <w:t>ser.readline</w:t>
+      </w:r>
+      <w:proofErr w:type="spellEnd"/>
       <w:r>
         <w:rPr>
           <w:b/>
           <w:bCs/>
         </w:rPr>
+        <w:t>()</w:t>
+      </w:r>
+      <w:r>
+        <w:t>, ktorá zo sériového portu (vo virtuálnom prostredí označenom ako /</w:t>
+      </w:r>
+      <w:proofErr w:type="spellStart"/>
+      <w:r>
+        <w:t>dev</w:t>
+      </w:r>
+      <w:proofErr w:type="spellEnd"/>
+      <w:r>
+        <w:t>/ttyUSB0 alebo /</w:t>
+      </w:r>
+      <w:proofErr w:type="spellStart"/>
+      <w:r>
+        <w:t>dev</w:t>
+      </w:r>
+      <w:proofErr w:type="spellEnd"/>
+      <w:r>
+        <w:t>/ttyACM0)</w:t>
+      </w:r>
+      <w:r>
+        <w:t xml:space="preserve"> neustále prijíma dáta z </w:t>
+      </w:r>
+      <w:proofErr w:type="spellStart"/>
+      <w:r>
+        <w:t>Arduina</w:t>
+      </w:r>
+      <w:proofErr w:type="spellEnd"/>
+      <w:r>
+        <w:t xml:space="preserve"> (Teplota, otáčky) a odosiela príkazy (PWM) naspäť do hardvéru.</w:t>
+      </w:r>
+    </w:p>
+    <w:p>
+      <w:pPr>
+        <w:pStyle w:val="Zoznamsodrkami"/>
+      </w:pPr>
+      <w:r>
+        <w:rPr>
+          <w:b/>
+          <w:bCs/>
+        </w:rPr>
         <w:t>Implementácia regulátora:</w:t>
       </w:r>
       <w:r>
@@ -1939,39 +2487,61 @@
       <w:r>
         <w:t xml:space="preserve"> regulačný režim (</w:t>
       </w:r>
+      <w:proofErr w:type="spellStart"/>
       <w:r>
         <w:rPr>
           <w:i/>
           <w:iCs/>
         </w:rPr>
-        <w:t>is_running = true</w:t>
-      </w:r>
-      <w:r>
-        <w:t>), kód vypočíta regulačnú odchýlku</w:t>
-      </w:r>
-      <w:r>
-        <w:t xml:space="preserve"> ako rozdiel medzi aktuálnou a žiadanou hodnotou. Táto odchýlka sa následne vynásobí konštantou zosilnenia </w:t>
-      </w:r>
+        <w:t>is_running</w:t>
+      </w:r>
+      <w:proofErr w:type="spellEnd"/>
       <w:r>
         <w:rPr>
           <w:i/>
           <w:iCs/>
         </w:rPr>
-        <w:t>Kp</w:t>
-      </w:r>
-      <w:r>
-        <w:t>.</w:t>
-      </w:r>
-      <w:r>
-        <w:t xml:space="preserve"> Výsledkom je výkon ventilátora obmedzený na hranicu maximálneho PWM signálu 0-255. Konštanta </w:t>
-      </w:r>
+        <w:t xml:space="preserve"> = </w:t>
+      </w:r>
+      <w:proofErr w:type="spellStart"/>
       <w:r>
         <w:rPr>
           <w:i/>
           <w:iCs/>
         </w:rPr>
+        <w:t>true</w:t>
+      </w:r>
+      <w:proofErr w:type="spellEnd"/>
+      <w:r>
+        <w:t>), kód vypočíta regulačnú odchýlku</w:t>
+      </w:r>
+      <w:r>
+        <w:t xml:space="preserve"> ako rozdiel medzi aktuálnou a žiadanou hodnotou. Táto odchýlka sa následne vynásobí konštantou zosilnenia </w:t>
+      </w:r>
+      <w:proofErr w:type="spellStart"/>
+      <w:r>
+        <w:rPr>
+          <w:i/>
+          <w:iCs/>
+        </w:rPr>
         <w:t>Kp</w:t>
       </w:r>
+      <w:proofErr w:type="spellEnd"/>
+      <w:r>
+        <w:t>.</w:t>
+      </w:r>
+      <w:r>
+        <w:t xml:space="preserve"> Výsledkom je výkon ventilátora obmedzený na hranicu maximálneho PWM signálu 0-255. Konštanta </w:t>
+      </w:r>
+      <w:proofErr w:type="spellStart"/>
+      <w:r>
+        <w:rPr>
+          <w:i/>
+          <w:iCs/>
+        </w:rPr>
+        <w:t>Kp</w:t>
+      </w:r>
+      <w:proofErr w:type="spellEnd"/>
       <w:r>
         <w:t xml:space="preserve"> sa dá vo webovom rozhraní nastaviť, odporúčam nechať 50</w:t>
       </w:r>
@@ -2002,6 +2572,7 @@
       <w:r>
         <w:t xml:space="preserve"> Pomocou novej </w:t>
       </w:r>
+      <w:proofErr w:type="spellStart"/>
       <w:r>
         <w:rPr>
           <w:i/>
@@ -2009,9 +2580,11 @@
         </w:rPr>
         <w:t>socketio</w:t>
       </w:r>
+      <w:proofErr w:type="spellEnd"/>
       <w:r>
         <w:t xml:space="preserve"> udalosti vieme získať parameter </w:t>
       </w:r>
+      <w:proofErr w:type="spellStart"/>
       <w:r>
         <w:rPr>
           <w:i/>
@@ -2019,6 +2592,7 @@
         </w:rPr>
         <w:t>Kp</w:t>
       </w:r>
+      <w:proofErr w:type="spellEnd"/>
       <w:r>
         <w:t xml:space="preserve"> a parameter </w:t>
       </w:r>
@@ -2071,7 +2645,15 @@
         <w:t>CLOSE</w:t>
       </w:r>
       <w:r>
-        <w:t xml:space="preserve"> kód pošle do Arduina príkaz s nulovým výkonom, čím sa </w:t>
+        <w:t xml:space="preserve"> kód pošle do </w:t>
+      </w:r>
+      <w:proofErr w:type="spellStart"/>
+      <w:r>
+        <w:t>Arduina</w:t>
+      </w:r>
+      <w:proofErr w:type="spellEnd"/>
+      <w:r>
+        <w:t xml:space="preserve"> príkaz s nulovým výkonom, čím sa </w:t>
       </w:r>
       <w:r>
         <w:t>otáčky na ventilátore ihneď na 0.</w:t>
@@ -2158,7 +2740,7 @@
       <w:pPr>
         <w:pStyle w:val="Nadpis3"/>
       </w:pPr>
-      <w:bookmarkStart w:id="7" w:name="_Toc228522746"/>
+      <w:bookmarkStart w:id="7" w:name="_Toc228523848"/>
       <w:r>
         <w:t>Klientska časť kódu – tabs.html</w:t>
       </w:r>
@@ -2236,6 +2818,7 @@
       <w:r>
         <w:t xml:space="preserve"> V ovládacej zložke ako bolo spomenuté vyššie, je nastavenie parametra </w:t>
       </w:r>
+      <w:proofErr w:type="spellStart"/>
       <w:r>
         <w:rPr>
           <w:i/>
@@ -2243,9 +2826,11 @@
         </w:rPr>
         <w:t>Kp</w:t>
       </w:r>
+      <w:proofErr w:type="spellEnd"/>
       <w:r>
         <w:t xml:space="preserve"> a </w:t>
       </w:r>
+      <w:proofErr w:type="spellStart"/>
       <w:r>
         <w:rPr>
           <w:i/>
@@ -2253,6 +2838,7 @@
         </w:rPr>
         <w:t>SETPOINTu</w:t>
       </w:r>
+      <w:proofErr w:type="spellEnd"/>
       <w:r>
         <w:t>, čiže žiadanej teploty.</w:t>
       </w:r>
@@ -2314,7 +2900,7 @@
       <w:pPr>
         <w:pStyle w:val="Nadpis3"/>
       </w:pPr>
-      <w:bookmarkStart w:id="8" w:name="_Toc228522747"/>
+      <w:bookmarkStart w:id="8" w:name="_Toc228523849"/>
       <w:r>
         <w:t>Ovládanie aplikácie</w:t>
       </w:r>
@@ -2325,7 +2911,23 @@
         <w:pStyle w:val="Bezodsadenia"/>
       </w:pPr>
       <w:r>
-        <w:t xml:space="preserve">Prvotným krokom je nahratie kódu z Arduino IDE do Arduina. Následne je vo virtuálnom prostredí potrebné spustiť súbor </w:t>
+        <w:t>Prvotným krokom je nahratie kódu z </w:t>
+      </w:r>
+      <w:proofErr w:type="spellStart"/>
+      <w:r>
+        <w:t>Arduino</w:t>
+      </w:r>
+      <w:proofErr w:type="spellEnd"/>
+      <w:r>
+        <w:t xml:space="preserve"> IDE do </w:t>
+      </w:r>
+      <w:proofErr w:type="spellStart"/>
+      <w:r>
+        <w:t>Arduina</w:t>
+      </w:r>
+      <w:proofErr w:type="spellEnd"/>
+      <w:r>
+        <w:t xml:space="preserve">. Následne je vo virtuálnom prostredí potrebné spustiť súbor </w:t>
       </w:r>
       <w:r>
         <w:rPr>
@@ -2340,12 +2942,21 @@
       <w:r>
         <w:t xml:space="preserve"> v mieste úložiska pomocou príkazu </w:t>
       </w:r>
+      <w:proofErr w:type="spellStart"/>
       <w:r>
         <w:rPr>
           <w:i/>
           <w:iCs/>
         </w:rPr>
-        <w:t>sudo python3 app.py</w:t>
+        <w:t>sudo</w:t>
+      </w:r>
+      <w:proofErr w:type="spellEnd"/>
+      <w:r>
+        <w:rPr>
+          <w:i/>
+          <w:iCs/>
+        </w:rPr>
+        <w:t xml:space="preserve"> python3 app.py</w:t>
       </w:r>
       <w:r>
         <w:t>.</w:t>
@@ -2359,6 +2970,7 @@
       <w:r>
         <w:t xml:space="preserve"> 127.0.0.1 sa spustí aplikácia. Je potrebné sa pripojiť pomocou tlačidla </w:t>
       </w:r>
+      <w:proofErr w:type="spellStart"/>
       <w:r>
         <w:rPr>
           <w:b/>
@@ -2366,12 +2978,14 @@
         </w:rPr>
         <w:t>open</w:t>
       </w:r>
+      <w:proofErr w:type="spellEnd"/>
       <w:r>
         <w:t xml:space="preserve"> a následne </w:t>
       </w:r>
       <w:r>
         <w:t xml:space="preserve">pre spustenie regulácie je potrebné stlačiť tlačidlo </w:t>
       </w:r>
+      <w:proofErr w:type="spellStart"/>
       <w:r>
         <w:rPr>
           <w:b/>
@@ -2379,8 +2993,436 @@
         </w:rPr>
         <w:t>Start</w:t>
       </w:r>
+      <w:proofErr w:type="spellEnd"/>
       <w:r>
         <w:t>.</w:t>
+      </w:r>
+    </w:p>
+    <w:p>
+      <w:pPr>
+        <w:pStyle w:val="Nadpis3"/>
+      </w:pPr>
+      <w:bookmarkStart w:id="9" w:name="_Toc228523850"/>
+      <w:r>
+        <w:t>Používateľská príručka</w:t>
+      </w:r>
+      <w:bookmarkEnd w:id="9"/>
+    </w:p>
+    <w:p>
+      <w:pPr>
+        <w:pStyle w:val="Zoznamsodrkami"/>
+      </w:pPr>
+      <w:r>
+        <w:rPr>
+          <w:b/>
+          <w:bCs/>
+        </w:rPr>
+        <w:t>Pripojenie k systému:</w:t>
+      </w:r>
+      <w:r>
+        <w:t xml:space="preserve"> Po otvorení stránky </w:t>
+      </w:r>
+      <w:r>
+        <w:t xml:space="preserve">127.0.0.1 </w:t>
+      </w:r>
+      <w:r>
+        <w:t xml:space="preserve">stlačí používateľ tlačidlo </w:t>
+      </w:r>
+      <w:proofErr w:type="spellStart"/>
+      <w:r>
+        <w:t>Open</w:t>
+      </w:r>
+      <w:proofErr w:type="spellEnd"/>
+      <w:r>
+        <w:t xml:space="preserve">. Tým sa nadviaže obojsmerná komunikácia s </w:t>
+      </w:r>
+      <w:proofErr w:type="spellStart"/>
+      <w:r>
+        <w:t>Arduinom</w:t>
+      </w:r>
+      <w:proofErr w:type="spellEnd"/>
+      <w:r>
+        <w:t xml:space="preserve"> a aktivujú sa senzory.</w:t>
+      </w:r>
+    </w:p>
+    <w:p>
+      <w:pPr>
+        <w:pStyle w:val="Zoznamsodrkami"/>
+      </w:pPr>
+      <w:r>
+        <w:rPr>
+          <w:b/>
+          <w:bCs/>
+        </w:rPr>
+        <w:t>Nastavenie regulácie:</w:t>
+      </w:r>
+      <w:r>
+        <w:t xml:space="preserve"> V používateľskom rozhraní má používateľ k dispozícii polia na zadanie žiadaných parametrov. Môže si zvoliť žiadanú teplotu (</w:t>
+      </w:r>
+      <w:r>
+        <w:t>SETPOINT</w:t>
+      </w:r>
+      <w:r>
+        <w:t>) a zosilnenie P-regulátora (</w:t>
+      </w:r>
+      <w:proofErr w:type="spellStart"/>
+      <w:r>
+        <w:t>Kp</w:t>
+      </w:r>
+      <w:proofErr w:type="spellEnd"/>
+      <w:r>
+        <w:t>). Tieto údaje sa odošlú na server a okamžite ovplyvnia priebeh regulácie.</w:t>
+      </w:r>
+    </w:p>
+    <w:p>
+      <w:pPr>
+        <w:pStyle w:val="Zoznamsodrkami"/>
+      </w:pPr>
+      <w:r>
+        <w:rPr>
+          <w:b/>
+          <w:bCs/>
+        </w:rPr>
+        <w:t>Spustenie:</w:t>
+      </w:r>
+      <w:r>
+        <w:t xml:space="preserve"> Samotné monitorovanie a regulačný proces (zapínanie/vypínanie ventilátora podľa teploty) sa odštartuje stlačením tlačidla </w:t>
+      </w:r>
+      <w:proofErr w:type="spellStart"/>
+      <w:r>
+        <w:rPr>
+          <w:b/>
+          <w:bCs/>
+        </w:rPr>
+        <w:t>Start</w:t>
+      </w:r>
+      <w:r>
+        <w:t>.</w:t>
+      </w:r>
+      <w:proofErr w:type="spellEnd"/>
+    </w:p>
+    <w:p>
+      <w:pPr>
+        <w:pStyle w:val="Zoznamsodrkami"/>
+      </w:pPr>
+      <w:r>
+        <w:rPr>
+          <w:b/>
+          <w:bCs/>
+        </w:rPr>
+        <w:t>Vizualizácia:</w:t>
+      </w:r>
+      <w:r>
+        <w:t xml:space="preserve"> Kým je proces spustený, na úvodnej stránke používateľ vidí v reálnom čase graf s dvoma premennými – teplotou a výkonom ventilátora (PWM). V druhej záložke sa nachádzajú ručičkové ukazovatele (ciferníky), ktoré numericky a graficky indikujú aktuálny stav.</w:t>
+      </w:r>
+    </w:p>
+    <w:p>
+      <w:pPr>
+        <w:pStyle w:val="Zoznamsodrkami"/>
+      </w:pPr>
+      <w:r>
+        <w:rPr>
+          <w:b/>
+          <w:bCs/>
+        </w:rPr>
+        <w:t>Zastavenie a archivácia:</w:t>
+      </w:r>
+      <w:r>
+        <w:t xml:space="preserve"> Proces sa ukončuje stlačením tlačidla </w:t>
+      </w:r>
+      <w:r>
+        <w:rPr>
+          <w:b/>
+          <w:bCs/>
+        </w:rPr>
+        <w:t>Stop</w:t>
+      </w:r>
+      <w:r>
+        <w:t xml:space="preserve">. V tom okamihu systém okamžite zastaví ventilátor a zaznamenanú históriu signálov automaticky uloží do databázy a textového súboru. Tieto historické dáta si vie používateľ zobraziť </w:t>
+      </w:r>
+      <w:r>
+        <w:lastRenderedPageBreak/>
+        <w:t xml:space="preserve">kliknutím na tlačidlo Zobraz historické dáta, ktoré následne vykreslí archívny graf s dvoma Y-osovými mierkami (jedna pre teplotu, druhá pre výkon). </w:t>
+      </w:r>
+    </w:p>
+    <w:p>
+      <w:pPr>
+        <w:pStyle w:val="Zoznamsodrkami"/>
+      </w:pPr>
+      <w:r>
+        <w:rPr>
+          <w:b/>
+          <w:bCs/>
+        </w:rPr>
+        <w:t>Ukončenie práce:</w:t>
+      </w:r>
+      <w:r>
+        <w:t xml:space="preserve"> Po skončení sledovania a práce so systémom použije používateľ tlačidlo </w:t>
+      </w:r>
+      <w:proofErr w:type="spellStart"/>
+      <w:r>
+        <w:t>Close</w:t>
+      </w:r>
+      <w:proofErr w:type="spellEnd"/>
+      <w:r>
+        <w:t xml:space="preserve">, ktoré celú aplikáciu deaktivuje a ukončí spojenie so serverom a </w:t>
+      </w:r>
+      <w:proofErr w:type="spellStart"/>
+      <w:r>
+        <w:t>Arduinom</w:t>
+      </w:r>
+      <w:proofErr w:type="spellEnd"/>
+      <w:r>
+        <w:t>.</w:t>
+      </w:r>
+    </w:p>
+    <w:p/>
+    <w:p>
+      <w:pPr>
+        <w:pStyle w:val="Nadpis3"/>
+      </w:pPr>
+      <w:bookmarkStart w:id="10" w:name="_Toc228523851"/>
+      <w:r>
+        <w:t>Vývojárska príručka a architektúra</w:t>
+      </w:r>
+      <w:bookmarkEnd w:id="10"/>
+    </w:p>
+    <w:p>
+      <w:pPr>
+        <w:pStyle w:val="Zoznamsodrkami"/>
+      </w:pPr>
+      <w:r>
+        <w:rPr>
+          <w:b/>
+          <w:bCs/>
+        </w:rPr>
+        <w:t>Komunikačné protokoly:</w:t>
+      </w:r>
+      <w:r>
+        <w:t xml:space="preserve"> Na prenos vizualizačných prvkov do prehliadača sa využíva bežný HTTP protokol. Zabezpečenie prenosu dát v reálnom čase bez nutnosti obnovovania stránky zabezpečuje </w:t>
+      </w:r>
+      <w:proofErr w:type="spellStart"/>
+      <w:r>
+        <w:t>WebSocket</w:t>
+      </w:r>
+      <w:proofErr w:type="spellEnd"/>
+      <w:r>
+        <w:t xml:space="preserve"> prostredníctvom knižnice </w:t>
+      </w:r>
+      <w:proofErr w:type="spellStart"/>
+      <w:r>
+        <w:t>Flask-SocketIO</w:t>
+      </w:r>
+      <w:proofErr w:type="spellEnd"/>
+      <w:r>
+        <w:t xml:space="preserve">. Táto technológia umožňuje asynchrónne odosielanie parametrov z klienta na server a okamžité prijímanie zmeraných signálov do grafov a ciferníkov. Komunikácia medzi </w:t>
+      </w:r>
+      <w:proofErr w:type="spellStart"/>
+      <w:r>
+        <w:t>Flask</w:t>
+      </w:r>
+      <w:proofErr w:type="spellEnd"/>
+      <w:r>
+        <w:t xml:space="preserve"> serverom a hardvérom (</w:t>
+      </w:r>
+      <w:proofErr w:type="spellStart"/>
+      <w:r>
+        <w:t>Arduino</w:t>
+      </w:r>
+      <w:proofErr w:type="spellEnd"/>
+      <w:r>
+        <w:t xml:space="preserve">) prebieha prostredníctvom sériovej linky (UART/USB </w:t>
+      </w:r>
+      <w:proofErr w:type="spellStart"/>
+      <w:r>
+        <w:t>Passthrough</w:t>
+      </w:r>
+      <w:proofErr w:type="spellEnd"/>
+      <w:r>
+        <w:t xml:space="preserve">) s využitím knižnice </w:t>
+      </w:r>
+      <w:proofErr w:type="spellStart"/>
+      <w:r>
+        <w:rPr>
+          <w:i/>
+          <w:iCs/>
+        </w:rPr>
+        <w:t>pyserial</w:t>
+      </w:r>
+      <w:proofErr w:type="spellEnd"/>
+      <w:r>
+        <w:t xml:space="preserve">. </w:t>
+      </w:r>
+    </w:p>
+    <w:p>
+      <w:pPr>
+        <w:pStyle w:val="Zoznamsodrkami"/>
+      </w:pPr>
+      <w:r>
+        <w:rPr>
+          <w:b/>
+          <w:bCs/>
+        </w:rPr>
+        <w:t>Spustenie servera:</w:t>
+      </w:r>
+      <w:r>
+        <w:t xml:space="preserve"> Pre úspešný štart aplikácie je potrebné vo virtuálnom prostredí OS s nainštalovaným prostredím </w:t>
+      </w:r>
+      <w:proofErr w:type="spellStart"/>
+      <w:r>
+        <w:t>Python</w:t>
+      </w:r>
+      <w:proofErr w:type="spellEnd"/>
+      <w:r>
+        <w:t xml:space="preserve"> spustiť príkaz </w:t>
+      </w:r>
+      <w:proofErr w:type="spellStart"/>
+      <w:r>
+        <w:rPr>
+          <w:i/>
+          <w:iCs/>
+        </w:rPr>
+        <w:t>sudo</w:t>
+      </w:r>
+      <w:proofErr w:type="spellEnd"/>
+      <w:r>
+        <w:rPr>
+          <w:i/>
+          <w:iCs/>
+        </w:rPr>
+        <w:t xml:space="preserve"> python3</w:t>
+      </w:r>
+      <w:r>
+        <w:t xml:space="preserve"> </w:t>
+      </w:r>
+      <w:r>
+        <w:rPr>
+          <w:i/>
+          <w:iCs/>
+        </w:rPr>
+        <w:t>app.py</w:t>
+      </w:r>
+      <w:r>
+        <w:t>.</w:t>
+      </w:r>
+    </w:p>
+    <w:p>
+      <w:pPr>
+        <w:pStyle w:val="Nadpis3"/>
+      </w:pPr>
+      <w:bookmarkStart w:id="11" w:name="_Toc228523852"/>
+      <w:r>
+        <w:lastRenderedPageBreak/>
+        <w:t>UML diagram</w:t>
+      </w:r>
+      <w:bookmarkEnd w:id="11"/>
+    </w:p>
+    <w:p>
+      <w:pPr>
+        <w:pStyle w:val="Obrzok"/>
+        <w:spacing w:before="240"/>
+      </w:pPr>
+      <w:r>
+        <w:drawing>
+          <wp:inline distT="0" distB="0" distL="0" distR="0" wp14:anchorId="54A27DF6" wp14:editId="228CF181">
+            <wp:extent cx="5580380" cy="4507230"/>
+            <wp:effectExtent l="0" t="0" r="1270" b="7620"/>
+            <wp:docPr id="2" name="Obrázok 2"/>
+            <wp:cNvGraphicFramePr>
+              <a:graphicFrameLocks xmlns:a="http://schemas.openxmlformats.org/drawingml/2006/main" noChangeAspect="1"/>
+            </wp:cNvGraphicFramePr>
+            <a:graphic xmlns:a="http://schemas.openxmlformats.org/drawingml/2006/main">
+              <a:graphicData uri="http://schemas.openxmlformats.org/drawingml/2006/picture">
+                <pic:pic xmlns:pic="http://schemas.openxmlformats.org/drawingml/2006/picture">
+                  <pic:nvPicPr>
+                    <pic:cNvPr id="1" name=""/>
+                    <pic:cNvPicPr/>
+                  </pic:nvPicPr>
+                  <pic:blipFill>
+                    <a:blip r:embed="rId15"/>
+                    <a:stretch>
+                      <a:fillRect/>
+                    </a:stretch>
+                  </pic:blipFill>
+                  <pic:spPr>
+                    <a:xfrm>
+                      <a:off x="0" y="0"/>
+                      <a:ext cx="5580380" cy="4507230"/>
+                    </a:xfrm>
+                    <a:prstGeom prst="rect">
+                      <a:avLst/>
+                    </a:prstGeom>
+                  </pic:spPr>
+                </pic:pic>
+              </a:graphicData>
+            </a:graphic>
+          </wp:inline>
+        </w:drawing>
+      </w:r>
+    </w:p>
+    <w:p>
+      <w:pPr>
+        <w:pStyle w:val="Popis"/>
+      </w:pPr>
+      <w:r>
+        <w:rPr>
+          <w:b/>
+          <w:bCs/>
+        </w:rPr>
+        <w:t xml:space="preserve">Obrázok </w:t>
+      </w:r>
+      <w:r>
+        <w:rPr>
+          <w:b/>
+          <w:bCs/>
+        </w:rPr>
+        <w:fldChar w:fldCharType="begin"/>
+      </w:r>
+      <w:r>
+        <w:rPr>
+          <w:b/>
+          <w:bCs/>
+        </w:rPr>
+        <w:instrText xml:space="preserve"> SEQ Obrázok \* ARABIC </w:instrText>
+      </w:r>
+      <w:r>
+        <w:rPr>
+          <w:b/>
+          <w:bCs/>
+        </w:rPr>
+        <w:fldChar w:fldCharType="separate"/>
+      </w:r>
+      <w:r>
+        <w:rPr>
+          <w:b/>
+          <w:bCs/>
+          <w:noProof/>
+        </w:rPr>
+        <w:t>5</w:t>
+      </w:r>
+      <w:r>
+        <w:rPr>
+          <w:b/>
+          <w:bCs/>
+        </w:rPr>
+        <w:fldChar w:fldCharType="end"/>
+      </w:r>
+      <w:r>
+        <w:rPr>
+          <w:b/>
+          <w:bCs/>
+        </w:rPr>
+        <w:t>:</w:t>
+      </w:r>
+      <w:r>
+        <w:rPr>
+          <w:b/>
+          <w:bCs/>
+        </w:rPr>
+        <w:t xml:space="preserve"> </w:t>
+      </w:r>
+      <w:r>
+        <w:t>UML diagram.</w:t>
       </w:r>
     </w:p>
     <w:p>
@@ -2388,26 +3430,146 @@
         <w:pStyle w:val="Nadpis1bezslovania"/>
         <w:spacing w:after="480"/>
       </w:pPr>
-      <w:bookmarkStart w:id="9" w:name="_Toc228522748"/>
+      <w:bookmarkStart w:id="12" w:name="_Toc228523853"/>
       <w:r>
         <w:lastRenderedPageBreak/>
         <w:t>Záver</w:t>
       </w:r>
-      <w:bookmarkEnd w:id="9"/>
-    </w:p>
-    <w:p>
-      <w:r>
-        <w:t>Cieľom semestrálneho zadania bolo vytvoriť plne funkčný systém v koncepcii IoT pre monitorovanie a riadenie teploty, čo sa úspešne podarilo zrealizovať. Systém prepája mikrokontrolér Arduino Uno so senzorom DHT11 a ventilátorom ARCTIC P12 Slim s virtuálnym prostredím, na ktorom beží webová aplikácia vytvorená v jazyku Python pomocou frameworku Flask.</w:t>
-      </w:r>
-    </w:p>
-    <w:p>
-      <w:r>
-        <w:t>Aplikácia úspešne spĺňa všetky požiadavky zadania. Klientska časť poskytuje intuitívne webové rozhranie na ovládanie systému (tlačidlá Open, Start, Stop, Close) a nastavenie parametrov regulácie (žiadaná hodnota a zosilnenie Kp pre P-regulátor). Namerané dáta – teplota a výkon ventilátora – sú v reálnom čase monitorované a vizualizované pomocou samostatných grafov aj ručičkových ciferníkov.</w:t>
-      </w:r>
-    </w:p>
-    <w:p>
-      <w:r>
-        <w:t>Implementovaná bola obojsmerná sériová komunikácia, ktorá zabezpečuje prenos senzorických dát do serverovej časti a naopak, zasielanie riadiacich PWM signálov pre akčný člen na základe regulačnej odchýlky. Aplikácia taktiež obsahuje plnohodnotnú funkcionalitu archivácie. Namerané dáta a nastavené parametre sa bezpečne ukladajú do SQLite databázy a textového súboru pre neskoršiu analýzu, pričom je k dispozícii aj ich spätné vykreslenie s využitím sekundárnej osi Y pre prehľadné porovnanie. Vývoj projektu prebiehal za využitia verzionovacieho systému GitHub, kde je dostupný kompletný zdrojový kód.</w:t>
+      <w:bookmarkEnd w:id="12"/>
+    </w:p>
+    <w:p>
+      <w:r>
+        <w:t xml:space="preserve">Cieľom semestrálneho zadania bolo vytvoriť plne funkčný systém v koncepcii </w:t>
+      </w:r>
+      <w:proofErr w:type="spellStart"/>
+      <w:r>
+        <w:t>IoT</w:t>
+      </w:r>
+      <w:proofErr w:type="spellEnd"/>
+      <w:r>
+        <w:t xml:space="preserve"> pre monitorovanie a riadenie teploty, čo sa úspešne podarilo zrealizovať. Systém prepája </w:t>
+      </w:r>
+      <w:proofErr w:type="spellStart"/>
+      <w:r>
+        <w:t>mikrokontrolér</w:t>
+      </w:r>
+      <w:proofErr w:type="spellEnd"/>
+      <w:r>
+        <w:t xml:space="preserve"> </w:t>
+      </w:r>
+      <w:proofErr w:type="spellStart"/>
+      <w:r>
+        <w:t>Arduino</w:t>
+      </w:r>
+      <w:proofErr w:type="spellEnd"/>
+      <w:r>
+        <w:t xml:space="preserve"> </w:t>
+      </w:r>
+      <w:proofErr w:type="spellStart"/>
+      <w:r>
+        <w:t>Uno</w:t>
+      </w:r>
+      <w:proofErr w:type="spellEnd"/>
+      <w:r>
+        <w:t xml:space="preserve"> so senzorom DHT11 a ventilátorom ARCTIC P12 </w:t>
+      </w:r>
+      <w:proofErr w:type="spellStart"/>
+      <w:r>
+        <w:t>Slim</w:t>
+      </w:r>
+      <w:proofErr w:type="spellEnd"/>
+      <w:r>
+        <w:t xml:space="preserve"> s virtuálnym prostredím, na ktorom beží webová aplikácia vytvorená v jazyku </w:t>
+      </w:r>
+      <w:proofErr w:type="spellStart"/>
+      <w:r>
+        <w:t>Python</w:t>
+      </w:r>
+      <w:proofErr w:type="spellEnd"/>
+      <w:r>
+        <w:t xml:space="preserve"> pomocou </w:t>
+      </w:r>
+      <w:proofErr w:type="spellStart"/>
+      <w:r>
+        <w:t>frameworku</w:t>
+      </w:r>
+      <w:proofErr w:type="spellEnd"/>
+      <w:r>
+        <w:t xml:space="preserve"> </w:t>
+      </w:r>
+      <w:proofErr w:type="spellStart"/>
+      <w:r>
+        <w:t>Flask</w:t>
+      </w:r>
+      <w:proofErr w:type="spellEnd"/>
+      <w:r>
+        <w:t>.</w:t>
+      </w:r>
+    </w:p>
+    <w:p>
+      <w:r>
+        <w:t xml:space="preserve">Aplikácia úspešne spĺňa všetky požiadavky zadania. Klientska časť poskytuje intuitívne webové rozhranie na ovládanie systému (tlačidlá </w:t>
+      </w:r>
+      <w:proofErr w:type="spellStart"/>
+      <w:r>
+        <w:t>Open</w:t>
+      </w:r>
+      <w:proofErr w:type="spellEnd"/>
+      <w:r>
+        <w:t xml:space="preserve">, </w:t>
+      </w:r>
+      <w:proofErr w:type="spellStart"/>
+      <w:r>
+        <w:t>Start</w:t>
+      </w:r>
+      <w:proofErr w:type="spellEnd"/>
+      <w:r>
+        <w:t xml:space="preserve">, Stop, </w:t>
+      </w:r>
+      <w:proofErr w:type="spellStart"/>
+      <w:r>
+        <w:t>Close</w:t>
+      </w:r>
+      <w:proofErr w:type="spellEnd"/>
+      <w:r>
+        <w:t xml:space="preserve">) a nastavenie parametrov regulácie (žiadaná hodnota a zosilnenie </w:t>
+      </w:r>
+      <w:proofErr w:type="spellStart"/>
+      <w:r>
+        <w:t>Kp</w:t>
+      </w:r>
+      <w:proofErr w:type="spellEnd"/>
+      <w:r>
+        <w:t xml:space="preserve"> pre P-regulátor). Namerané dáta – teplota a výkon ventilátora – sú v reálnom čase monitorované a vizualizované pomocou samostatných grafov aj ručičkových ciferníkov.</w:t>
+      </w:r>
+    </w:p>
+    <w:p>
+      <w:r>
+        <w:t xml:space="preserve">Implementovaná bola obojsmerná sériová komunikácia, ktorá zabezpečuje prenos senzorických dát do serverovej časti a naopak, zasielanie riadiacich PWM signálov pre akčný člen na základe regulačnej odchýlky. Aplikácia taktiež obsahuje plnohodnotnú funkcionalitu archivácie. Namerané dáta a nastavené parametre sa bezpečne ukladajú do </w:t>
+      </w:r>
+      <w:proofErr w:type="spellStart"/>
+      <w:r>
+        <w:t>SQLite</w:t>
+      </w:r>
+      <w:proofErr w:type="spellEnd"/>
+      <w:r>
+        <w:t xml:space="preserve"> databázy a textového súboru pre neskoršiu analýzu, pričom je k dispozícii aj ich spätné vykreslenie s využitím sekundárnej osi Y pre prehľadné porovnanie. Vývoj projektu prebiehal za využitia </w:t>
+      </w:r>
+      <w:proofErr w:type="spellStart"/>
+      <w:r>
+        <w:t>verzionovacieho</w:t>
+      </w:r>
+      <w:proofErr w:type="spellEnd"/>
+      <w:r>
+        <w:t xml:space="preserve"> systému </w:t>
+      </w:r>
+      <w:proofErr w:type="spellStart"/>
+      <w:r>
+        <w:t>GitHub</w:t>
+      </w:r>
+      <w:proofErr w:type="spellEnd"/>
+      <w:r>
+        <w:t>, kde je dostupný kompletný zdrojový kód.</w:t>
       </w:r>
     </w:p>
     <w:p>
@@ -2420,10 +3582,12 @@
         <w:pStyle w:val="Nadpis1bezslovania"/>
         <w:spacing w:after="480"/>
       </w:pPr>
+      <w:bookmarkStart w:id="13" w:name="_Toc228523854"/>
       <w:r>
         <w:lastRenderedPageBreak/>
         <w:t>Zdroje</w:t>
       </w:r>
+      <w:bookmarkEnd w:id="13"/>
     </w:p>
     <w:sdt>
       <w:sdtPr>
@@ -2463,7 +3627,70 @@
               <w:color w:val="000000"/>
             </w:rPr>
             <w:tab/>
-            <w:t>Techfun, “Senzor teploty a vlhkosti DHT11”, Accessed: Apr. 30, 2026. [Online]. Available: https://techfun.sk/produkt/senzor-teploty-a-vlhkosti-dht11/</w:t>
+          </w:r>
+          <w:proofErr w:type="spellStart"/>
+          <w:r>
+            <w:rPr>
+              <w:rFonts w:ascii="Times New Roman" w:eastAsia="Times New Roman" w:hAnsi="Times New Roman" w:cs="Times New Roman"/>
+              <w:color w:val="000000"/>
+            </w:rPr>
+            <w:t>Techfun</w:t>
+          </w:r>
+          <w:proofErr w:type="spellEnd"/>
+          <w:r>
+            <w:rPr>
+              <w:rFonts w:ascii="Times New Roman" w:eastAsia="Times New Roman" w:hAnsi="Times New Roman" w:cs="Times New Roman"/>
+              <w:color w:val="000000"/>
+            </w:rPr>
+            <w:t xml:space="preserve">, “Senzor teploty a vlhkosti DHT11”, </w:t>
+          </w:r>
+          <w:proofErr w:type="spellStart"/>
+          <w:r>
+            <w:rPr>
+              <w:rFonts w:ascii="Times New Roman" w:eastAsia="Times New Roman" w:hAnsi="Times New Roman" w:cs="Times New Roman"/>
+              <w:color w:val="000000"/>
+            </w:rPr>
+            <w:t>Accessed</w:t>
+          </w:r>
+          <w:proofErr w:type="spellEnd"/>
+          <w:r>
+            <w:rPr>
+              <w:rFonts w:ascii="Times New Roman" w:eastAsia="Times New Roman" w:hAnsi="Times New Roman" w:cs="Times New Roman"/>
+              <w:color w:val="000000"/>
+            </w:rPr>
+            <w:t xml:space="preserve">: </w:t>
+          </w:r>
+          <w:proofErr w:type="spellStart"/>
+          <w:r>
+            <w:rPr>
+              <w:rFonts w:ascii="Times New Roman" w:eastAsia="Times New Roman" w:hAnsi="Times New Roman" w:cs="Times New Roman"/>
+              <w:color w:val="000000"/>
+            </w:rPr>
+            <w:t>Apr</w:t>
+          </w:r>
+          <w:proofErr w:type="spellEnd"/>
+          <w:r>
+            <w:rPr>
+              <w:rFonts w:ascii="Times New Roman" w:eastAsia="Times New Roman" w:hAnsi="Times New Roman" w:cs="Times New Roman"/>
+              <w:color w:val="000000"/>
+            </w:rPr>
+            <w:t xml:space="preserve">. 30, 2026. [Online]. </w:t>
+          </w:r>
+          <w:proofErr w:type="spellStart"/>
+          <w:r>
+            <w:rPr>
+              <w:rFonts w:ascii="Times New Roman" w:eastAsia="Times New Roman" w:hAnsi="Times New Roman" w:cs="Times New Roman"/>
+              <w:color w:val="000000"/>
+            </w:rPr>
+            <w:t>Available</w:t>
+          </w:r>
+          <w:proofErr w:type="spellEnd"/>
+          <w:r>
+            <w:rPr>
+              <w:rFonts w:ascii="Times New Roman" w:eastAsia="Times New Roman" w:hAnsi="Times New Roman" w:cs="Times New Roman"/>
+              <w:color w:val="000000"/>
+            </w:rPr>
+            <w:t>: https://techfun.sk/produkt/senzor-teploty-a-vlhkosti-dht11/</w:t>
           </w:r>
         </w:p>
         <w:p>
@@ -2490,7 +3717,86 @@
               <w:color w:val="000000"/>
             </w:rPr>
             <w:tab/>
-            <w:t>Alza, “Ventilátor ARCTIC P12 Slim”, Accessed: Apr. 30, 2026. [Online]. Available: https://www.alza.sk/arctic-p12-slim-pwm-pst-d6321551.htm</w:t>
+          </w:r>
+          <w:proofErr w:type="spellStart"/>
+          <w:r>
+            <w:rPr>
+              <w:rFonts w:ascii="Times New Roman" w:eastAsia="Times New Roman" w:hAnsi="Times New Roman" w:cs="Times New Roman"/>
+              <w:color w:val="000000"/>
+            </w:rPr>
+            <w:t>Alza</w:t>
+          </w:r>
+          <w:proofErr w:type="spellEnd"/>
+          <w:r>
+            <w:rPr>
+              <w:rFonts w:ascii="Times New Roman" w:eastAsia="Times New Roman" w:hAnsi="Times New Roman" w:cs="Times New Roman"/>
+              <w:color w:val="000000"/>
+            </w:rPr>
+            <w:t xml:space="preserve">, “Ventilátor ARCTIC P12 </w:t>
+          </w:r>
+          <w:proofErr w:type="spellStart"/>
+          <w:r>
+            <w:rPr>
+              <w:rFonts w:ascii="Times New Roman" w:eastAsia="Times New Roman" w:hAnsi="Times New Roman" w:cs="Times New Roman"/>
+              <w:color w:val="000000"/>
+            </w:rPr>
+            <w:t>Slim</w:t>
+          </w:r>
+          <w:proofErr w:type="spellEnd"/>
+          <w:r>
+            <w:rPr>
+              <w:rFonts w:ascii="Times New Roman" w:eastAsia="Times New Roman" w:hAnsi="Times New Roman" w:cs="Times New Roman"/>
+              <w:color w:val="000000"/>
+            </w:rPr>
+            <w:t xml:space="preserve">”, </w:t>
+          </w:r>
+          <w:proofErr w:type="spellStart"/>
+          <w:r>
+            <w:rPr>
+              <w:rFonts w:ascii="Times New Roman" w:eastAsia="Times New Roman" w:hAnsi="Times New Roman" w:cs="Times New Roman"/>
+              <w:color w:val="000000"/>
+            </w:rPr>
+            <w:t>Accessed</w:t>
+          </w:r>
+          <w:proofErr w:type="spellEnd"/>
+          <w:r>
+            <w:rPr>
+              <w:rFonts w:ascii="Times New Roman" w:eastAsia="Times New Roman" w:hAnsi="Times New Roman" w:cs="Times New Roman"/>
+              <w:color w:val="000000"/>
+            </w:rPr>
+            <w:t xml:space="preserve">: </w:t>
+          </w:r>
+          <w:proofErr w:type="spellStart"/>
+          <w:r>
+            <w:rPr>
+              <w:rFonts w:ascii="Times New Roman" w:eastAsia="Times New Roman" w:hAnsi="Times New Roman" w:cs="Times New Roman"/>
+              <w:color w:val="000000"/>
+            </w:rPr>
+            <w:t>Apr</w:t>
+          </w:r>
+          <w:proofErr w:type="spellEnd"/>
+          <w:r>
+            <w:rPr>
+              <w:rFonts w:ascii="Times New Roman" w:eastAsia="Times New Roman" w:hAnsi="Times New Roman" w:cs="Times New Roman"/>
+              <w:color w:val="000000"/>
+            </w:rPr>
+            <w:t xml:space="preserve">. 30, 2026. [Online]. </w:t>
+          </w:r>
+          <w:proofErr w:type="spellStart"/>
+          <w:r>
+            <w:rPr>
+              <w:rFonts w:ascii="Times New Roman" w:eastAsia="Times New Roman" w:hAnsi="Times New Roman" w:cs="Times New Roman"/>
+              <w:color w:val="000000"/>
+            </w:rPr>
+            <w:t>Available</w:t>
+          </w:r>
+          <w:proofErr w:type="spellEnd"/>
+          <w:r>
+            <w:rPr>
+              <w:rFonts w:ascii="Times New Roman" w:eastAsia="Times New Roman" w:hAnsi="Times New Roman" w:cs="Times New Roman"/>
+              <w:color w:val="000000"/>
+            </w:rPr>
+            <w:t>: https://www.alza.sk/arctic-p12-slim-pwm-pst-d6321551.htm</w:t>
           </w:r>
         </w:p>
         <w:p>
@@ -2508,7 +3814,7 @@
       </w:sdtContent>
     </w:sdt>
     <w:sectPr>
-      <w:footerReference w:type="default" r:id="rId15"/>
+      <w:footerReference w:type="default" r:id="rId16"/>
       <w:type w:val="continuous"/>
       <w:pgSz w:w="11906" w:h="16838"/>
       <w:pgMar w:top="1701" w:right="1559" w:bottom="1701" w:left="1559" w:header="709" w:footer="709" w:gutter="0"/>

</xml_diff>